<commit_message>
Update architecture diagram for Oracle migration
</commit_message>
<xml_diff>
--- a/backend/ArquitectureDiagram.docx
+++ b/backend/ArquitectureDiagram.docx
@@ -1,6 +1,6 @@
 
 <file path=word/document.xml><?xml version="1.0" encoding="utf-8"?>
-<w:document xmlns:wpc="http://schemas.microsoft.com/office/word/2010/wordprocessingCanvas" xmlns:cx="http://schemas.microsoft.com/office/drawing/2014/chartex" xmlns:cx1="http://schemas.microsoft.com/office/drawing/2015/9/8/chartex" xmlns:cx2="http://schemas.microsoft.com/office/drawing/2015/10/21/chartex" xmlns:cx3="http://schemas.microsoft.com/office/drawing/2016/5/9/chartex" xmlns:cx4="http://schemas.microsoft.com/office/drawing/2016/5/10/chartex" xmlns:cx5="http://schemas.microsoft.com/office/drawing/2016/5/11/chartex" xmlns:cx6="http://schemas.microsoft.com/office/drawing/2016/5/12/chartex" xmlns:cx7="http://schemas.microsoft.com/office/drawing/2016/5/13/chartex" xmlns:cx8="http://schemas.microsoft.com/office/drawing/2016/5/14/chartex" xmlns:mc="http://schemas.openxmlformats.org/markup-compatibility/2006" xmlns:aink="http://schemas.microsoft.com/office/drawing/2016/ink" xmlns:am3d="http://schemas.microsoft.com/office/drawing/2017/model3d" xmlns:o="urn:schemas-microsoft-com:office:office" xmlns:r="http://schemas.openxmlformats.org/officeDocument/2006/relationships" xmlns:m="http://schemas.openxmlformats.org/officeDocument/2006/math" xmlns:v="urn:schemas-microsoft-com:vml" xmlns:wp14="http://schemas.microsoft.com/office/word/2010/wordprocessingDrawing" xmlns:wp="http://schemas.openxmlformats.org/drawingml/2006/wordprocessingDrawing" xmlns:w10="urn:schemas-microsoft-com:office:word" xmlns:w="http://schemas.openxmlformats.org/wordprocessingml/2006/main" xmlns:w14="http://schemas.microsoft.com/office/word/2010/wordml" xmlns:w15="http://schemas.microsoft.com/office/word/2012/wordml" xmlns:w16cex="http://schemas.microsoft.com/office/word/2018/wordml/cex" xmlns:w16cid="http://schemas.microsoft.com/office/word/2016/wordml/cid" xmlns:w16="http://schemas.microsoft.com/office/word/2018/wordml" xmlns:w16sdtdh="http://schemas.microsoft.com/office/word/2020/wordml/sdtdatahash" xmlns:w16se="http://schemas.microsoft.com/office/word/2015/wordml/symex" xmlns:wpg="http://schemas.microsoft.com/office/word/2010/wordprocessingGroup" xmlns:wpi="http://schemas.microsoft.com/office/word/2010/wordprocessingInk" xmlns:wne="http://schemas.microsoft.com/office/word/2006/wordml" xmlns:wps="http://schemas.microsoft.com/office/word/2010/wordprocessingShape" mc:Ignorable="w14 w15 w16se w16cid w16 w16cex w16sdtdh wp14">
+<w:document xmlns:wpc="http://schemas.microsoft.com/office/word/2010/wordprocessingCanvas" xmlns:cx="http://schemas.microsoft.com/office/drawing/2014/chartex" xmlns:cx1="http://schemas.microsoft.com/office/drawing/2015/9/8/chartex" xmlns:cx2="http://schemas.microsoft.com/office/drawing/2015/10/21/chartex" xmlns:cx3="http://schemas.microsoft.com/office/drawing/2016/5/9/chartex" xmlns:cx4="http://schemas.microsoft.com/office/drawing/2016/5/10/chartex" xmlns:cx5="http://schemas.microsoft.com/office/drawing/2016/5/11/chartex" xmlns:cx6="http://schemas.microsoft.com/office/drawing/2016/5/12/chartex" xmlns:cx7="http://schemas.microsoft.com/office/drawing/2016/5/13/chartex" xmlns:cx8="http://schemas.microsoft.com/office/drawing/2016/5/14/chartex" xmlns:mc="http://schemas.openxmlformats.org/markup-compatibility/2006" xmlns:aink="http://schemas.microsoft.com/office/drawing/2016/ink" xmlns:am3d="http://schemas.microsoft.com/office/drawing/2017/model3d" xmlns:o="urn:schemas-microsoft-com:office:office" xmlns:oel="http://schemas.microsoft.com/office/2019/extlst" xmlns:r="http://schemas.openxmlformats.org/officeDocument/2006/relationships" xmlns:m="http://schemas.openxmlformats.org/officeDocument/2006/math" xmlns:v="urn:schemas-microsoft-com:vml" xmlns:wp14="http://schemas.microsoft.com/office/word/2010/wordprocessingDrawing" xmlns:wp="http://schemas.openxmlformats.org/drawingml/2006/wordprocessingDrawing" xmlns:w10="urn:schemas-microsoft-com:office:word" xmlns:w="http://schemas.openxmlformats.org/wordprocessingml/2006/main" xmlns:w14="http://schemas.microsoft.com/office/word/2010/wordml" xmlns:w15="http://schemas.microsoft.com/office/word/2012/wordml" xmlns:w16cex="http://schemas.microsoft.com/office/word/2018/wordml/cex" xmlns:w16cid="http://schemas.microsoft.com/office/word/2016/wordml/cid" xmlns:w16="http://schemas.microsoft.com/office/word/2018/wordml" xmlns:w16du="http://schemas.microsoft.com/office/word/2023/wordml/word16du" xmlns:w16sdtdh="http://schemas.microsoft.com/office/word/2020/wordml/sdtdatahash" xmlns:w16sdtfl="http://schemas.microsoft.com/office/word/2024/wordml/sdtformatlock" xmlns:w16se="http://schemas.microsoft.com/office/word/2015/wordml/symex" xmlns:wpg="http://schemas.microsoft.com/office/word/2010/wordprocessingGroup" xmlns:wpi="http://schemas.microsoft.com/office/word/2010/wordprocessingInk" xmlns:wne="http://schemas.microsoft.com/office/word/2006/wordml" xmlns:wps="http://schemas.microsoft.com/office/word/2010/wordprocessingShape" mc:Ignorable="w14 w15 w16se w16cid w16 w16cex w16sdtdh w16sdtfl w16du wp14">
   <w:body>
     <w:p>
       <w:r>
@@ -10,18 +10,18 @@
         <mc:AlternateContent>
           <mc:Choice Requires="wps">
             <w:drawing>
-              <wp:anchor distT="0" distB="0" distL="114300" distR="114300" simplePos="0" relativeHeight="251694080" behindDoc="0" locked="0" layoutInCell="1" allowOverlap="1" wp14:anchorId="018BB003" wp14:editId="1302A16D">
+              <wp:anchor distT="0" distB="0" distL="114300" distR="114300" simplePos="0" relativeHeight="251692032" behindDoc="0" locked="0" layoutInCell="1" allowOverlap="1" wp14:anchorId="6C5EC785" wp14:editId="44965FAA">
                 <wp:simplePos x="0" y="0"/>
                 <wp:positionH relativeFrom="column">
-                  <wp:posOffset>456260</wp:posOffset>
+                  <wp:posOffset>3639576</wp:posOffset>
                 </wp:positionH>
                 <wp:positionV relativeFrom="paragraph">
-                  <wp:posOffset>3562350</wp:posOffset>
+                  <wp:posOffset>2230267</wp:posOffset>
                 </wp:positionV>
-                <wp:extent cx="1587373" cy="212090"/>
-                <wp:effectExtent l="0" t="0" r="13335" b="16510"/>
+                <wp:extent cx="1784350" cy="274661"/>
+                <wp:effectExtent l="0" t="0" r="25400" b="11430"/>
                 <wp:wrapNone/>
-                <wp:docPr id="4" name="Rectángulo 4"/>
+                <wp:docPr id="27" name="Rectángulo 27"/>
                 <wp:cNvGraphicFramePr/>
                 <a:graphic xmlns:a="http://schemas.openxmlformats.org/drawingml/2006/main">
                   <a:graphicData uri="http://schemas.microsoft.com/office/word/2010/wordprocessingShape">
@@ -30,13 +30,16 @@
                       <wps:spPr>
                         <a:xfrm>
                           <a:off x="0" y="0"/>
-                          <a:ext cx="1587373" cy="212090"/>
+                          <a:ext cx="1784350" cy="274661"/>
                         </a:xfrm>
                         <a:prstGeom prst="rect">
                           <a:avLst/>
                         </a:prstGeom>
                         <a:solidFill>
-                          <a:schemeClr val="bg1"/>
+                          <a:schemeClr val="accent1">
+                            <a:lumMod val="60000"/>
+                            <a:lumOff val="40000"/>
+                          </a:schemeClr>
                         </a:solidFill>
                         <a:ln>
                           <a:solidFill>
@@ -65,19 +68,30 @@
                           <w:p>
                             <w:pPr>
                               <w:jc w:val="center"/>
-                              <w:rPr>
-                                <w:color w:val="000000" w:themeColor="text1"/>
-                              </w:rPr>
                             </w:pPr>
                             <w:r>
                               <w:rPr>
-                                <w:b/>
-                                <w:bCs/>
-                                <w:color w:val="000000" w:themeColor="text1"/>
-                                <w:sz w:val="16"/>
-                                <w:szCs w:val="16"/>
-                              </w:rPr>
-                              <w:t>DESKTOP-EC6OIR8\\SQLEXPRESS</w:t>
+                                <w:color w:val="000000" w:themeColor="text1"/>
+                                <w:sz w:val="18"/>
+                                <w:szCs w:val="18"/>
+                              </w:rPr>
+                              <w:t>Angular 18.0.</w:t>
+                            </w:r>
+                            <w:r>
+                              <w:rPr>
+                                <w:color w:val="000000" w:themeColor="text1"/>
+                                <w:sz w:val="18"/>
+                                <w:szCs w:val="18"/>
+                              </w:rPr>
+                              <w:t>11</w:t>
+                            </w:r>
+                            <w:r>
+                              <w:rPr>
+                                <w:color w:val="000000" w:themeColor="text1"/>
+                                <w:sz w:val="18"/>
+                                <w:szCs w:val="18"/>
+                              </w:rPr>
+                              <w:t xml:space="preserve"> / Typescript</w:t>
                             </w:r>
                           </w:p>
                         </w:txbxContent>
@@ -102,25 +116,36 @@
           </mc:Choice>
           <mc:Fallback>
             <w:pict>
-              <v:rect w14:anchorId="018BB003" id="Rectángulo 4" o:spid="_x0000_s1026" style="position:absolute;margin-left:35.95pt;margin-top:280.5pt;width:125pt;height:16.7pt;z-index:251694080;visibility:visible;mso-wrap-style:square;mso-width-percent:0;mso-height-percent:0;mso-wrap-distance-left:9pt;mso-wrap-distance-top:0;mso-wrap-distance-right:9pt;mso-wrap-distance-bottom:0;mso-position-horizontal:absolute;mso-position-horizontal-relative:text;mso-position-vertical:absolute;mso-position-vertical-relative:text;mso-width-percent:0;mso-height-percent:0;mso-width-relative:margin;mso-height-relative:margin;v-text-anchor:middle" o:gfxdata="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" fillcolor="white [3212]" strokecolor="white [3212]" strokeweight="1pt">
+              <v:rect w14:anchorId="6C5EC785" id="Rectángulo 27" o:spid="_x0000_s1026" style="position:absolute;margin-left:286.6pt;margin-top:175.6pt;width:140.5pt;height:21.65pt;z-index:251692032;visibility:visible;mso-wrap-style:square;mso-width-percent:0;mso-height-percent:0;mso-wrap-distance-left:9pt;mso-wrap-distance-top:0;mso-wrap-distance-right:9pt;mso-wrap-distance-bottom:0;mso-position-horizontal:absolute;mso-position-horizontal-relative:text;mso-position-vertical:absolute;mso-position-vertical-relative:text;mso-width-percent:0;mso-height-percent:0;mso-width-relative:margin;mso-height-relative:margin;v-text-anchor:middle" o:gfxdata="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" fillcolor="#9cc2e5 [1940]" strokecolor="white [3212]" strokeweight="1pt">
                 <v:textbox>
                   <w:txbxContent>
                     <w:p>
                       <w:pPr>
                         <w:jc w:val="center"/>
-                        <w:rPr>
-                          <w:color w:val="000000" w:themeColor="text1"/>
-                        </w:rPr>
                       </w:pPr>
                       <w:r>
                         <w:rPr>
-                          <w:b/>
-                          <w:bCs/>
-                          <w:color w:val="000000" w:themeColor="text1"/>
-                          <w:sz w:val="16"/>
-                          <w:szCs w:val="16"/>
-                        </w:rPr>
-                        <w:t>DESKTOP-EC6OIR8\\SQLEXPRESS</w:t>
+                          <w:color w:val="000000" w:themeColor="text1"/>
+                          <w:sz w:val="18"/>
+                          <w:szCs w:val="18"/>
+                        </w:rPr>
+                        <w:t>Angular 18.0.</w:t>
+                      </w:r>
+                      <w:r>
+                        <w:rPr>
+                          <w:color w:val="000000" w:themeColor="text1"/>
+                          <w:sz w:val="18"/>
+                          <w:szCs w:val="18"/>
+                        </w:rPr>
+                        <w:t>11</w:t>
+                      </w:r>
+                      <w:r>
+                        <w:rPr>
+                          <w:color w:val="000000" w:themeColor="text1"/>
+                          <w:sz w:val="18"/>
+                          <w:szCs w:val="18"/>
+                        </w:rPr>
+                        <w:t xml:space="preserve"> / Typescript</w:t>
                       </w:r>
                     </w:p>
                   </w:txbxContent>
@@ -137,16 +162,16 @@
         <mc:AlternateContent>
           <mc:Choice Requires="wps">
             <w:drawing>
-              <wp:anchor distT="0" distB="0" distL="114300" distR="114300" simplePos="0" relativeHeight="251687936" behindDoc="0" locked="0" layoutInCell="1" allowOverlap="1" wp14:anchorId="7679041B" wp14:editId="0FDA47EB">
+              <wp:anchor distT="0" distB="0" distL="114300" distR="114300" simplePos="0" relativeHeight="251687936" behindDoc="0" locked="0" layoutInCell="1" allowOverlap="1" wp14:anchorId="7679041B" wp14:editId="4B07CF54">
                 <wp:simplePos x="0" y="0"/>
                 <wp:positionH relativeFrom="column">
-                  <wp:posOffset>1699642</wp:posOffset>
+                  <wp:posOffset>1702822</wp:posOffset>
                 </wp:positionH>
                 <wp:positionV relativeFrom="paragraph">
-                  <wp:posOffset>4389095</wp:posOffset>
+                  <wp:posOffset>4387822</wp:posOffset>
                 </wp:positionV>
-                <wp:extent cx="1009498" cy="519379"/>
-                <wp:effectExtent l="0" t="0" r="19685" b="14605"/>
+                <wp:extent cx="1763422" cy="518795"/>
+                <wp:effectExtent l="0" t="0" r="27305" b="14605"/>
                 <wp:wrapNone/>
                 <wp:docPr id="25" name="Rectángulo 25"/>
                 <wp:cNvGraphicFramePr/>
@@ -157,7 +182,7 @@
                       <wps:spPr>
                         <a:xfrm>
                           <a:off x="0" y="0"/>
-                          <a:ext cx="1009498" cy="519379"/>
+                          <a:ext cx="1763422" cy="518795"/>
                         </a:xfrm>
                         <a:prstGeom prst="rect">
                           <a:avLst/>
@@ -240,9 +265,9 @@
                                 <w:color w:val="000000" w:themeColor="text1"/>
                                 <w:sz w:val="16"/>
                                 <w:szCs w:val="16"/>
+                                <w:lang w:val="es-ES"/>
                               </w:rPr>
                             </w:pPr>
-                            <w:proofErr w:type="spellStart"/>
                             <w:r>
                               <w:rPr>
                                 <w:b/>
@@ -250,32 +275,10 @@
                                 <w:color w:val="000000" w:themeColor="text1"/>
                                 <w:sz w:val="16"/>
                                 <w:szCs w:val="16"/>
-                              </w:rPr>
-                              <w:t>Database</w:t>
-                            </w:r>
-                            <w:proofErr w:type="spellEnd"/>
-                            <w:r>
-                              <w:rPr>
-                                <w:b/>
-                                <w:bCs/>
-                                <w:color w:val="000000" w:themeColor="text1"/>
-                                <w:sz w:val="16"/>
-                                <w:szCs w:val="16"/>
-                              </w:rPr>
-                              <w:t xml:space="preserve">: </w:t>
-                            </w:r>
-                            <w:proofErr w:type="spellStart"/>
-                            <w:r>
-                              <w:rPr>
-                                <w:b/>
-                                <w:bCs/>
-                                <w:color w:val="000000" w:themeColor="text1"/>
-                                <w:sz w:val="16"/>
-                                <w:szCs w:val="16"/>
-                              </w:rPr>
-                              <w:t>SellerDB</w:t>
-                            </w:r>
-                            <w:proofErr w:type="spellEnd"/>
+                                <w:lang w:val="es-ES"/>
+                              </w:rPr>
+                              <w:t>Data Source=localhost:1521/XEPDB1</w:t>
+                            </w:r>
                           </w:p>
                           <w:p>
                             <w:pPr>
@@ -286,7 +289,6 @@
                                 <w:color w:val="000000" w:themeColor="text1"/>
                               </w:rPr>
                             </w:pPr>
-                            <w:proofErr w:type="spellStart"/>
                             <w:r>
                               <w:rPr>
                                 <w:b/>
@@ -297,7 +299,6 @@
                               </w:rPr>
                               <w:t>User</w:t>
                             </w:r>
-                            <w:proofErr w:type="spellEnd"/>
                             <w:r>
                               <w:rPr>
                                 <w:b/>
@@ -308,7 +309,6 @@
                               </w:rPr>
                               <w:t xml:space="preserve">: </w:t>
                             </w:r>
-                            <w:proofErr w:type="spellStart"/>
                             <w:r>
                               <w:rPr>
                                 <w:b/>
@@ -316,10 +316,10 @@
                                 <w:color w:val="000000" w:themeColor="text1"/>
                                 <w:sz w:val="16"/>
                                 <w:szCs w:val="16"/>
-                              </w:rPr>
-                              <w:t>root</w:t>
-                            </w:r>
-                            <w:proofErr w:type="spellEnd"/>
+                                <w:lang w:val="es-ES"/>
+                              </w:rPr>
+                              <w:t>SELLER_APP</w:t>
+                            </w:r>
                           </w:p>
                           <w:p>
                             <w:pPr>
@@ -351,7 +351,7 @@
           </mc:Choice>
           <mc:Fallback>
             <w:pict>
-              <v:rect w14:anchorId="7679041B" id="Rectángulo 25" o:spid="_x0000_s1026" style="position:absolute;margin-left:133.85pt;margin-top:345.6pt;width:79.5pt;height:40.9pt;z-index:251687936;visibility:visible;mso-wrap-style:square;mso-width-percent:0;mso-height-percent:0;mso-wrap-distance-left:9pt;mso-wrap-distance-top:0;mso-wrap-distance-right:9pt;mso-wrap-distance-bottom:0;mso-position-horizontal:absolute;mso-position-horizontal-relative:text;mso-position-vertical:absolute;mso-position-vertical-relative:text;mso-width-percent:0;mso-height-percent:0;mso-width-relative:margin;mso-height-relative:margin;v-text-anchor:middle" o:gfxdata="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" fillcolor="white [3212]" strokecolor="white [3212]" strokeweight="1pt">
+              <v:rect w14:anchorId="7679041B" id="Rectángulo 25" o:spid="_x0000_s1027" style="position:absolute;margin-left:134.1pt;margin-top:345.5pt;width:138.85pt;height:40.85pt;z-index:251687936;visibility:visible;mso-wrap-style:square;mso-width-percent:0;mso-height-percent:0;mso-wrap-distance-left:9pt;mso-wrap-distance-top:0;mso-wrap-distance-right:9pt;mso-wrap-distance-bottom:0;mso-position-horizontal:absolute;mso-position-horizontal-relative:text;mso-position-vertical:absolute;mso-position-vertical-relative:text;mso-width-percent:0;mso-height-percent:0;mso-width-relative:margin;mso-height-relative:margin;v-text-anchor:middle" o:gfxdata="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" fillcolor="white [3212]" strokecolor="white [3212]" strokeweight="1pt">
                 <v:textbox>
                   <w:txbxContent>
                     <w:p>
@@ -405,9 +405,9 @@
                           <w:color w:val="000000" w:themeColor="text1"/>
                           <w:sz w:val="16"/>
                           <w:szCs w:val="16"/>
+                          <w:lang w:val="es-ES"/>
                         </w:rPr>
                       </w:pPr>
-                      <w:proofErr w:type="spellStart"/>
                       <w:r>
                         <w:rPr>
                           <w:b/>
@@ -415,32 +415,10 @@
                           <w:color w:val="000000" w:themeColor="text1"/>
                           <w:sz w:val="16"/>
                           <w:szCs w:val="16"/>
-                        </w:rPr>
-                        <w:t>Database</w:t>
-                      </w:r>
-                      <w:proofErr w:type="spellEnd"/>
-                      <w:r>
-                        <w:rPr>
-                          <w:b/>
-                          <w:bCs/>
-                          <w:color w:val="000000" w:themeColor="text1"/>
-                          <w:sz w:val="16"/>
-                          <w:szCs w:val="16"/>
-                        </w:rPr>
-                        <w:t xml:space="preserve">: </w:t>
-                      </w:r>
-                      <w:proofErr w:type="spellStart"/>
-                      <w:r>
-                        <w:rPr>
-                          <w:b/>
-                          <w:bCs/>
-                          <w:color w:val="000000" w:themeColor="text1"/>
-                          <w:sz w:val="16"/>
-                          <w:szCs w:val="16"/>
-                        </w:rPr>
-                        <w:t>SellerDB</w:t>
-                      </w:r>
-                      <w:proofErr w:type="spellEnd"/>
+                          <w:lang w:val="es-ES"/>
+                        </w:rPr>
+                        <w:t>Data Source=localhost:1521/XEPDB1</w:t>
+                      </w:r>
                     </w:p>
                     <w:p>
                       <w:pPr>
@@ -451,7 +429,6 @@
                           <w:color w:val="000000" w:themeColor="text1"/>
                         </w:rPr>
                       </w:pPr>
-                      <w:proofErr w:type="spellStart"/>
                       <w:r>
                         <w:rPr>
                           <w:b/>
@@ -462,7 +439,6 @@
                         </w:rPr>
                         <w:t>User</w:t>
                       </w:r>
-                      <w:proofErr w:type="spellEnd"/>
                       <w:r>
                         <w:rPr>
                           <w:b/>
@@ -473,7 +449,6 @@
                         </w:rPr>
                         <w:t xml:space="preserve">: </w:t>
                       </w:r>
-                      <w:proofErr w:type="spellStart"/>
                       <w:r>
                         <w:rPr>
                           <w:b/>
@@ -481,10 +456,10 @@
                           <w:color w:val="000000" w:themeColor="text1"/>
                           <w:sz w:val="16"/>
                           <w:szCs w:val="16"/>
-                        </w:rPr>
-                        <w:t>root</w:t>
-                      </w:r>
-                      <w:proofErr w:type="spellEnd"/>
+                          <w:lang w:val="es-ES"/>
+                        </w:rPr>
+                        <w:t>SELLER_APP</w:t>
+                      </w:r>
                     </w:p>
                     <w:p>
                       <w:pPr>
@@ -506,18 +481,18 @@
           <w:noProof/>
         </w:rPr>
         <w:drawing>
-          <wp:anchor distT="0" distB="0" distL="114300" distR="114300" simplePos="0" relativeHeight="251703296" behindDoc="0" locked="0" layoutInCell="1" allowOverlap="1" wp14:anchorId="02633A7F" wp14:editId="19428AA7">
+          <wp:anchor distT="0" distB="0" distL="114300" distR="114300" simplePos="0" relativeHeight="251655164" behindDoc="0" locked="0" layoutInCell="1" allowOverlap="1" wp14:anchorId="09489E6B" wp14:editId="4C080EEF">
             <wp:simplePos x="0" y="0"/>
-            <wp:positionH relativeFrom="column">
-              <wp:posOffset>704545</wp:posOffset>
+            <wp:positionH relativeFrom="margin">
+              <wp:posOffset>911556</wp:posOffset>
             </wp:positionH>
             <wp:positionV relativeFrom="paragraph">
-              <wp:posOffset>4820437</wp:posOffset>
+              <wp:posOffset>4608830</wp:posOffset>
             </wp:positionV>
-            <wp:extent cx="789863" cy="222945"/>
-            <wp:effectExtent l="0" t="0" r="0" b="5715"/>
+            <wp:extent cx="675861" cy="675861"/>
+            <wp:effectExtent l="0" t="0" r="0" b="0"/>
             <wp:wrapNone/>
-            <wp:docPr id="16" name="Imagen 16"/>
+            <wp:docPr id="1068301169" name="Imagen 27" descr="Oracle DataBase Enterprise Edition"/>
             <wp:cNvGraphicFramePr>
               <a:graphicFrameLocks xmlns:a="http://schemas.openxmlformats.org/drawingml/2006/main" noChangeAspect="1"/>
             </wp:cNvGraphicFramePr>
@@ -525,7 +500,7 @@
               <a:graphicData uri="http://schemas.openxmlformats.org/drawingml/2006/picture">
                 <pic:pic xmlns:pic="http://schemas.openxmlformats.org/drawingml/2006/picture">
                   <pic:nvPicPr>
-                    <pic:cNvPr id="0" name="Picture 1"/>
+                    <pic:cNvPr id="0" name="Picture 1" descr="Oracle DataBase Enterprise Edition"/>
                     <pic:cNvPicPr>
                       <a:picLocks noChangeAspect="1" noChangeArrowheads="1"/>
                     </pic:cNvPicPr>
@@ -546,74 +521,7 @@
                   <pic:spPr bwMode="auto">
                     <a:xfrm>
                       <a:off x="0" y="0"/>
-                      <a:ext cx="789863" cy="222945"/>
-                    </a:xfrm>
-                    <a:prstGeom prst="rect">
-                      <a:avLst/>
-                    </a:prstGeom>
-                    <a:noFill/>
-                    <a:ln>
-                      <a:noFill/>
-                    </a:ln>
-                  </pic:spPr>
-                </pic:pic>
-              </a:graphicData>
-            </a:graphic>
-            <wp14:sizeRelH relativeFrom="margin">
-              <wp14:pctWidth>0</wp14:pctWidth>
-            </wp14:sizeRelH>
-            <wp14:sizeRelV relativeFrom="margin">
-              <wp14:pctHeight>0</wp14:pctHeight>
-            </wp14:sizeRelV>
-          </wp:anchor>
-        </w:drawing>
-      </w:r>
-      <w:r>
-        <w:rPr>
-          <w:noProof/>
-        </w:rPr>
-        <w:drawing>
-          <wp:anchor distT="0" distB="0" distL="114300" distR="114300" simplePos="0" relativeHeight="251702272" behindDoc="0" locked="0" layoutInCell="1" allowOverlap="1" wp14:anchorId="61FA4078" wp14:editId="50F80004">
-            <wp:simplePos x="0" y="0"/>
-            <wp:positionH relativeFrom="column">
-              <wp:posOffset>3564890</wp:posOffset>
-            </wp:positionH>
-            <wp:positionV relativeFrom="paragraph">
-              <wp:posOffset>3606216</wp:posOffset>
-            </wp:positionV>
-            <wp:extent cx="702259" cy="467529"/>
-            <wp:effectExtent l="0" t="0" r="3175" b="8890"/>
-            <wp:wrapNone/>
-            <wp:docPr id="34" name="Imagen 34"/>
-            <wp:cNvGraphicFramePr>
-              <a:graphicFrameLocks xmlns:a="http://schemas.openxmlformats.org/drawingml/2006/main" noChangeAspect="1"/>
-            </wp:cNvGraphicFramePr>
-            <a:graphic xmlns:a="http://schemas.openxmlformats.org/drawingml/2006/main">
-              <a:graphicData uri="http://schemas.openxmlformats.org/drawingml/2006/picture">
-                <pic:pic xmlns:pic="http://schemas.openxmlformats.org/drawingml/2006/picture">
-                  <pic:nvPicPr>
-                    <pic:cNvPr id="0" name="Picture 27"/>
-                    <pic:cNvPicPr>
-                      <a:picLocks noChangeAspect="1" noChangeArrowheads="1"/>
-                    </pic:cNvPicPr>
-                  </pic:nvPicPr>
-                  <pic:blipFill>
-                    <a:blip r:embed="rId5" cstate="print">
-                      <a:extLst>
-                        <a:ext uri="{28A0092B-C50C-407E-A947-70E740481C1C}">
-                          <a14:useLocalDpi xmlns:a14="http://schemas.microsoft.com/office/drawing/2010/main" val="0"/>
-                        </a:ext>
-                      </a:extLst>
-                    </a:blip>
-                    <a:srcRect/>
-                    <a:stretch>
-                      <a:fillRect/>
-                    </a:stretch>
-                  </pic:blipFill>
-                  <pic:spPr bwMode="auto">
-                    <a:xfrm>
-                      <a:off x="0" y="0"/>
-                      <a:ext cx="702259" cy="467529"/>
+                      <a:ext cx="675861" cy="675861"/>
                     </a:xfrm>
                     <a:prstGeom prst="rect">
                       <a:avLst/>
@@ -642,7 +550,7 @@
         <mc:AlternateContent>
           <mc:Choice Requires="wps">
             <w:drawing>
-              <wp:anchor distT="0" distB="0" distL="114300" distR="114300" simplePos="0" relativeHeight="251656189" behindDoc="0" locked="0" layoutInCell="1" allowOverlap="1" wp14:anchorId="539ECB52" wp14:editId="0A4B608B">
+              <wp:anchor distT="0" distB="0" distL="114300" distR="114300" simplePos="0" relativeHeight="251656189" behindDoc="0" locked="0" layoutInCell="1" allowOverlap="1" wp14:anchorId="539ECB52" wp14:editId="79E65667">
                 <wp:simplePos x="0" y="0"/>
                 <wp:positionH relativeFrom="column">
                   <wp:posOffset>703580</wp:posOffset>
@@ -756,7 +664,7 @@
           </mc:Choice>
           <mc:Fallback>
             <w:pict>
-              <v:rect w14:anchorId="539ECB52" id="Rectángulo 8" o:spid="_x0000_s1026" style="position:absolute;margin-left:55.4pt;margin-top:12.05pt;width:85.2pt;height:29.35pt;z-index:251656189;visibility:visible;mso-wrap-style:square;mso-width-percent:0;mso-height-percent:0;mso-wrap-distance-left:9pt;mso-wrap-distance-top:0;mso-wrap-distance-right:9pt;mso-wrap-distance-bottom:0;mso-position-horizontal:absolute;mso-position-horizontal-relative:text;mso-position-vertical:absolute;mso-position-vertical-relative:text;mso-width-percent:0;mso-height-percent:0;mso-width-relative:margin;mso-height-relative:margin;v-text-anchor:middle" o:gfxdata="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" fillcolor="white [3212]" strokecolor="white [3212]" strokeweight="1pt">
+              <v:rect w14:anchorId="539ECB52" id="Rectángulo 8" o:spid="_x0000_s1028" style="position:absolute;margin-left:55.4pt;margin-top:12.05pt;width:85.2pt;height:29.35pt;z-index:251656189;visibility:visible;mso-wrap-style:square;mso-width-percent:0;mso-height-percent:0;mso-wrap-distance-left:9pt;mso-wrap-distance-top:0;mso-wrap-distance-right:9pt;mso-wrap-distance-bottom:0;mso-position-horizontal:absolute;mso-position-horizontal-relative:text;mso-position-vertical:absolute;mso-position-vertical-relative:text;mso-width-percent:0;mso-height-percent:0;mso-width-relative:margin;mso-height-relative:margin;v-text-anchor:middle" o:gfxdata="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" fillcolor="white [3212]" strokecolor="white [3212]" strokeweight="1pt">
                 <v:textbox>
                   <w:txbxContent>
                     <w:p>
@@ -836,7 +744,7 @@
                     </pic:cNvPicPr>
                   </pic:nvPicPr>
                   <pic:blipFill>
-                    <a:blip r:embed="rId6" cstate="print">
+                    <a:blip r:embed="rId5" cstate="print">
                       <a:extLst>
                         <a:ext uri="{28A0092B-C50C-407E-A947-70E740481C1C}">
                           <a14:useLocalDpi xmlns:a14="http://schemas.microsoft.com/office/drawing/2010/main" val="0"/>
@@ -903,7 +811,7 @@
                     </pic:cNvPicPr>
                   </pic:nvPicPr>
                   <pic:blipFill>
-                    <a:blip r:embed="rId7" cstate="print">
+                    <a:blip r:embed="rId6" cstate="print">
                       <a:extLst>
                         <a:ext uri="{28A0092B-C50C-407E-A947-70E740481C1C}">
                           <a14:useLocalDpi xmlns:a14="http://schemas.microsoft.com/office/drawing/2010/main" val="0"/>
@@ -1148,7 +1056,7 @@
         <mc:AlternateContent>
           <mc:Choice Requires="wps">
             <w:drawing>
-              <wp:anchor distT="0" distB="0" distL="114300" distR="114300" simplePos="0" relativeHeight="251664384" behindDoc="0" locked="0" layoutInCell="1" allowOverlap="1" wp14:anchorId="63EC0C8A" wp14:editId="279F26A5">
+              <wp:anchor distT="0" distB="0" distL="114300" distR="114300" simplePos="0" relativeHeight="251664384" behindDoc="0" locked="0" layoutInCell="1" allowOverlap="1" wp14:anchorId="63EC0C8A" wp14:editId="314DFCD3">
                 <wp:simplePos x="0" y="0"/>
                 <wp:positionH relativeFrom="column">
                   <wp:posOffset>704775</wp:posOffset>
@@ -1207,7 +1115,6 @@
                                 <w:color w:val="000000" w:themeColor="text1"/>
                               </w:rPr>
                             </w:pPr>
-                            <w:proofErr w:type="spellStart"/>
                             <w:r>
                               <w:rPr>
                                 <w:color w:val="000000" w:themeColor="text1"/>
@@ -1226,21 +1133,12 @@
                               </w:rPr>
                               <w:t>cture</w:t>
                             </w:r>
-                            <w:proofErr w:type="spellEnd"/>
-                            <w:r>
-                              <w:rPr>
-                                <w:color w:val="000000" w:themeColor="text1"/>
-                              </w:rPr>
-                              <w:t xml:space="preserve"> </w:t>
-                            </w:r>
-                            <w:proofErr w:type="spellStart"/>
-                            <w:r>
-                              <w:rPr>
-                                <w:color w:val="000000" w:themeColor="text1"/>
-                              </w:rPr>
-                              <w:t>Layer</w:t>
-                            </w:r>
-                            <w:proofErr w:type="spellEnd"/>
+                            <w:r>
+                              <w:rPr>
+                                <w:color w:val="000000" w:themeColor="text1"/>
+                              </w:rPr>
+                              <w:t xml:space="preserve"> Layer</w:t>
+                            </w:r>
                           </w:p>
                         </w:txbxContent>
                       </wps:txbx>
@@ -1261,7 +1159,7 @@
           </mc:Choice>
           <mc:Fallback>
             <w:pict>
-              <v:rect w14:anchorId="63EC0C8A" id="Rectángulo 5" o:spid="_x0000_s1026" style="position:absolute;margin-left:55.5pt;margin-top:156.1pt;width:110pt;height:25.9pt;z-index:251664384;visibility:visible;mso-wrap-style:square;mso-width-percent:0;mso-wrap-distance-left:9pt;mso-wrap-distance-top:0;mso-wrap-distance-right:9pt;mso-wrap-distance-bottom:0;mso-position-horizontal:absolute;mso-position-horizontal-relative:text;mso-position-vertical:absolute;mso-position-vertical-relative:text;mso-width-percent:0;mso-width-relative:margin;v-text-anchor:middle" o:gfxdata="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" fillcolor="#92d050" strokecolor="black [3213]" strokeweight="1pt">
+              <v:rect w14:anchorId="63EC0C8A" id="Rectángulo 5" o:spid="_x0000_s1030" style="position:absolute;margin-left:55.5pt;margin-top:156.1pt;width:110pt;height:25.9pt;z-index:251664384;visibility:visible;mso-wrap-style:square;mso-width-percent:0;mso-wrap-distance-left:9pt;mso-wrap-distance-top:0;mso-wrap-distance-right:9pt;mso-wrap-distance-bottom:0;mso-position-horizontal:absolute;mso-position-horizontal-relative:text;mso-position-vertical:absolute;mso-position-vertical-relative:text;mso-width-percent:0;mso-width-relative:margin;v-text-anchor:middle" o:gfxdata="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" fillcolor="#92d050" strokecolor="black [3213]" strokeweight="1pt">
                 <v:textbox>
                   <w:txbxContent>
                     <w:p>
@@ -1294,168 +1192,6 @@
                           <w:color w:val="000000" w:themeColor="text1"/>
                         </w:rPr>
                         <w:t xml:space="preserve"> Layer</w:t>
-                      </w:r>
-                    </w:p>
-                  </w:txbxContent>
-                </v:textbox>
-              </v:rect>
-            </w:pict>
-          </mc:Fallback>
-        </mc:AlternateContent>
-      </w:r>
-      <w:r>
-        <w:rPr>
-          <w:noProof/>
-        </w:rPr>
-        <mc:AlternateContent>
-          <mc:Choice Requires="wps">
-            <w:drawing>
-              <wp:anchor distT="0" distB="0" distL="114300" distR="114300" simplePos="0" relativeHeight="251692032" behindDoc="0" locked="0" layoutInCell="1" allowOverlap="1" wp14:anchorId="6C5EC785" wp14:editId="7C57DA12">
-                <wp:simplePos x="0" y="0"/>
-                <wp:positionH relativeFrom="column">
-                  <wp:posOffset>3638169</wp:posOffset>
-                </wp:positionH>
-                <wp:positionV relativeFrom="paragraph">
-                  <wp:posOffset>2282317</wp:posOffset>
-                </wp:positionV>
-                <wp:extent cx="1784731" cy="225984"/>
-                <wp:effectExtent l="0" t="0" r="25400" b="22225"/>
-                <wp:wrapNone/>
-                <wp:docPr id="27" name="Rectángulo 27"/>
-                <wp:cNvGraphicFramePr/>
-                <a:graphic xmlns:a="http://schemas.openxmlformats.org/drawingml/2006/main">
-                  <a:graphicData uri="http://schemas.microsoft.com/office/word/2010/wordprocessingShape">
-                    <wps:wsp>
-                      <wps:cNvSpPr/>
-                      <wps:spPr>
-                        <a:xfrm>
-                          <a:off x="0" y="0"/>
-                          <a:ext cx="1784731" cy="225984"/>
-                        </a:xfrm>
-                        <a:prstGeom prst="rect">
-                          <a:avLst/>
-                        </a:prstGeom>
-                        <a:solidFill>
-                          <a:schemeClr val="accent1">
-                            <a:lumMod val="60000"/>
-                            <a:lumOff val="40000"/>
-                          </a:schemeClr>
-                        </a:solidFill>
-                        <a:ln>
-                          <a:solidFill>
-                            <a:schemeClr val="bg1"/>
-                          </a:solidFill>
-                        </a:ln>
-                      </wps:spPr>
-                      <wps:style>
-                        <a:lnRef idx="2">
-                          <a:schemeClr val="accent1">
-                            <a:shade val="50000"/>
-                          </a:schemeClr>
-                        </a:lnRef>
-                        <a:fillRef idx="1">
-                          <a:schemeClr val="accent1"/>
-                        </a:fillRef>
-                        <a:effectRef idx="0">
-                          <a:schemeClr val="accent1"/>
-                        </a:effectRef>
-                        <a:fontRef idx="minor">
-                          <a:schemeClr val="lt1"/>
-                        </a:fontRef>
-                      </wps:style>
-                      <wps:txbx>
-                        <w:txbxContent>
-                          <w:p>
-                            <w:pPr>
-                              <w:jc w:val="center"/>
-                            </w:pPr>
-                            <w:r>
-                              <w:rPr>
-                                <w:color w:val="000000" w:themeColor="text1"/>
-                                <w:sz w:val="18"/>
-                                <w:szCs w:val="18"/>
-                              </w:rPr>
-                              <w:t>Angular 18.0.</w:t>
-                            </w:r>
-                            <w:r>
-                              <w:rPr>
-                                <w:color w:val="000000" w:themeColor="text1"/>
-                                <w:sz w:val="18"/>
-                                <w:szCs w:val="18"/>
-                              </w:rPr>
-                              <w:t>11</w:t>
-                            </w:r>
-                            <w:r>
-                              <w:rPr>
-                                <w:color w:val="000000" w:themeColor="text1"/>
-                                <w:sz w:val="18"/>
-                                <w:szCs w:val="18"/>
-                              </w:rPr>
-                              <w:t xml:space="preserve"> / </w:t>
-                            </w:r>
-                            <w:proofErr w:type="spellStart"/>
-                            <w:r>
-                              <w:rPr>
-                                <w:color w:val="000000" w:themeColor="text1"/>
-                                <w:sz w:val="18"/>
-                                <w:szCs w:val="18"/>
-                              </w:rPr>
-                              <w:t>Typescript</w:t>
-                            </w:r>
-                            <w:proofErr w:type="spellEnd"/>
-                          </w:p>
-                        </w:txbxContent>
-                      </wps:txbx>
-                      <wps:bodyPr rot="0" spcFirstLastPara="0" vertOverflow="overflow" horzOverflow="overflow" vert="horz" wrap="square" lIns="91440" tIns="45720" rIns="91440" bIns="45720" numCol="1" spcCol="0" rtlCol="0" fromWordArt="0" anchor="ctr" anchorCtr="0" forceAA="0" compatLnSpc="1">
-                        <a:prstTxWarp prst="textNoShape">
-                          <a:avLst/>
-                        </a:prstTxWarp>
-                        <a:noAutofit/>
-                      </wps:bodyPr>
-                    </wps:wsp>
-                  </a:graphicData>
-                </a:graphic>
-                <wp14:sizeRelH relativeFrom="margin">
-                  <wp14:pctWidth>0</wp14:pctWidth>
-                </wp14:sizeRelH>
-                <wp14:sizeRelV relativeFrom="margin">
-                  <wp14:pctHeight>0</wp14:pctHeight>
-                </wp14:sizeRelV>
-              </wp:anchor>
-            </w:drawing>
-          </mc:Choice>
-          <mc:Fallback>
-            <w:pict>
-              <v:rect w14:anchorId="6C5EC785" id="Rectángulo 27" o:spid="_x0000_s1030" style="position:absolute;margin-left:286.45pt;margin-top:179.7pt;width:140.55pt;height:17.8pt;z-index:251692032;visibility:visible;mso-wrap-style:square;mso-width-percent:0;mso-height-percent:0;mso-wrap-distance-left:9pt;mso-wrap-distance-top:0;mso-wrap-distance-right:9pt;mso-wrap-distance-bottom:0;mso-position-horizontal:absolute;mso-position-horizontal-relative:text;mso-position-vertical:absolute;mso-position-vertical-relative:text;mso-width-percent:0;mso-height-percent:0;mso-width-relative:margin;mso-height-relative:margin;v-text-anchor:middle" o:gfxdata="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" fillcolor="#9cc2e5 [1940]" strokecolor="white [3212]" strokeweight="1pt">
-                <v:textbox>
-                  <w:txbxContent>
-                    <w:p>
-                      <w:pPr>
-                        <w:jc w:val="center"/>
-                      </w:pPr>
-                      <w:r>
-                        <w:rPr>
-                          <w:color w:val="000000" w:themeColor="text1"/>
-                          <w:sz w:val="18"/>
-                          <w:szCs w:val="18"/>
-                        </w:rPr>
-                        <w:t>Angular 18.0.</w:t>
-                      </w:r>
-                      <w:r>
-                        <w:rPr>
-                          <w:color w:val="000000" w:themeColor="text1"/>
-                          <w:sz w:val="18"/>
-                          <w:szCs w:val="18"/>
-                        </w:rPr>
-                        <w:t>11</w:t>
-                      </w:r>
-                      <w:r>
-                        <w:rPr>
-                          <w:color w:val="000000" w:themeColor="text1"/>
-                          <w:sz w:val="18"/>
-                          <w:szCs w:val="18"/>
-                        </w:rPr>
-                        <w:t xml:space="preserve"> / Typescript</w:t>
                       </w:r>
                     </w:p>
                   </w:txbxContent>
@@ -1542,7 +1278,15 @@
                                 <w:sz w:val="18"/>
                                 <w:szCs w:val="18"/>
                               </w:rPr>
-                              <w:t>NET Core 9.0 / C#</w:t>
+                              <w:t>.</w:t>
+                            </w:r>
+                            <w:r>
+                              <w:rPr>
+                                <w:color w:val="000000" w:themeColor="text1"/>
+                                <w:sz w:val="18"/>
+                                <w:szCs w:val="18"/>
+                              </w:rPr>
+                              <w:t>NET 9.0 / C#</w:t>
                             </w:r>
                           </w:p>
                         </w:txbxContent>
@@ -1564,7 +1308,7 @@
           </mc:Choice>
           <mc:Fallback>
             <w:pict>
-              <v:rect w14:anchorId="6DFE5282" id="Rectángulo 26" o:spid="_x0000_s1032" style="position:absolute;margin-left:15.15pt;margin-top:243.65pt;width:168.2pt;height:17.8pt;z-index:251689984;visibility:visible;mso-wrap-style:square;mso-height-percent:0;mso-wrap-distance-left:9pt;mso-wrap-distance-top:0;mso-wrap-distance-right:9pt;mso-wrap-distance-bottom:0;mso-position-horizontal:absolute;mso-position-horizontal-relative:text;mso-position-vertical:absolute;mso-position-vertical-relative:text;mso-height-percent:0;mso-height-relative:margin;v-text-anchor:middle" o:gfxdata="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" fillcolor="#a8d08d [1945]" strokecolor="white [3212]" strokeweight="1pt">
+              <v:rect w14:anchorId="6DFE5282" id="Rectángulo 26" o:spid="_x0000_s1031" style="position:absolute;margin-left:15.15pt;margin-top:243.65pt;width:168.2pt;height:17.8pt;z-index:251689984;visibility:visible;mso-wrap-style:square;mso-height-percent:0;mso-wrap-distance-left:9pt;mso-wrap-distance-top:0;mso-wrap-distance-right:9pt;mso-wrap-distance-bottom:0;mso-position-horizontal:absolute;mso-position-horizontal-relative:text;mso-position-vertical:absolute;mso-position-vertical-relative:text;mso-height-percent:0;mso-height-relative:margin;v-text-anchor:middle" o:gfxdata="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" fillcolor="#a8d08d [1945]" strokecolor="white [3212]" strokeweight="1pt">
                 <v:textbox>
                   <w:txbxContent>
                     <w:p>
@@ -1582,7 +1326,15 @@
                           <w:sz w:val="18"/>
                           <w:szCs w:val="18"/>
                         </w:rPr>
-                        <w:t>NET Core 9.0 / C#</w:t>
+                        <w:t>.</w:t>
+                      </w:r>
+                      <w:r>
+                        <w:rPr>
+                          <w:color w:val="000000" w:themeColor="text1"/>
+                          <w:sz w:val="18"/>
+                          <w:szCs w:val="18"/>
+                        </w:rPr>
+                        <w:t>NET 9.0 / C#</w:t>
                       </w:r>
                     </w:p>
                   </w:txbxContent>
@@ -1812,7 +1564,6 @@
                               </w:rPr>
                               <w:t xml:space="preserve">HTTP </w:t>
                             </w:r>
-                            <w:proofErr w:type="spellStart"/>
                             <w:r>
                               <w:rPr>
                                 <w:color w:val="000000" w:themeColor="text1"/>
@@ -1821,7 +1572,6 @@
                               </w:rPr>
                               <w:t>Request</w:t>
                             </w:r>
-                            <w:proofErr w:type="spellEnd"/>
                           </w:p>
                           <w:p>
                             <w:pPr>
@@ -2067,16 +1817,8 @@
                               <w:rPr>
                                 <w:color w:val="000000" w:themeColor="text1"/>
                               </w:rPr>
-                              <w:t xml:space="preserve"> </w:t>
-                            </w:r>
-                            <w:proofErr w:type="spellStart"/>
-                            <w:r>
-                              <w:rPr>
-                                <w:color w:val="000000" w:themeColor="text1"/>
-                              </w:rPr>
-                              <w:t>Models</w:t>
-                            </w:r>
-                            <w:proofErr w:type="spellEnd"/>
+                              <w:t xml:space="preserve"> Models</w:t>
+                            </w:r>
                           </w:p>
                           <w:p>
                             <w:pPr>
@@ -2242,14 +1984,12 @@
                                 <w:color w:val="000000" w:themeColor="text1"/>
                               </w:rPr>
                             </w:pPr>
-                            <w:proofErr w:type="spellStart"/>
                             <w:r>
                               <w:rPr>
                                 <w:color w:val="000000" w:themeColor="text1"/>
                               </w:rPr>
                               <w:t>Models</w:t>
                             </w:r>
-                            <w:proofErr w:type="spellEnd"/>
                           </w:p>
                           <w:p>
                             <w:pPr>
@@ -2508,14 +2248,12 @@
                                 <w:color w:val="000000" w:themeColor="text1"/>
                               </w:rPr>
                             </w:pPr>
-                            <w:proofErr w:type="spellStart"/>
                             <w:r>
                               <w:rPr>
                                 <w:color w:val="000000" w:themeColor="text1"/>
                               </w:rPr>
                               <w:t>Services</w:t>
                             </w:r>
-                            <w:proofErr w:type="spellEnd"/>
                           </w:p>
                           <w:p>
                             <w:pPr>
@@ -2689,116 +2427,7 @@
         <mc:AlternateContent>
           <mc:Choice Requires="wps">
             <w:drawing>
-              <wp:anchor distT="0" distB="0" distL="114300" distR="114300" simplePos="0" relativeHeight="251673600" behindDoc="0" locked="0" layoutInCell="1" allowOverlap="1" wp14:anchorId="1737723B" wp14:editId="11E3F593">
-                <wp:simplePos x="0" y="0"/>
-                <wp:positionH relativeFrom="column">
-                  <wp:posOffset>2283892</wp:posOffset>
-                </wp:positionH>
-                <wp:positionV relativeFrom="paragraph">
-                  <wp:posOffset>3605961</wp:posOffset>
-                </wp:positionV>
-                <wp:extent cx="1192377" cy="431597"/>
-                <wp:effectExtent l="0" t="0" r="27305" b="26035"/>
-                <wp:wrapNone/>
-                <wp:docPr id="14" name="Elipse 14"/>
-                <wp:cNvGraphicFramePr/>
-                <a:graphic xmlns:a="http://schemas.openxmlformats.org/drawingml/2006/main">
-                  <a:graphicData uri="http://schemas.microsoft.com/office/word/2010/wordprocessingShape">
-                    <wps:wsp>
-                      <wps:cNvSpPr/>
-                      <wps:spPr>
-                        <a:xfrm>
-                          <a:off x="0" y="0"/>
-                          <a:ext cx="1192377" cy="431597"/>
-                        </a:xfrm>
-                        <a:prstGeom prst="ellipse">
-                          <a:avLst/>
-                        </a:prstGeom>
-                        <a:solidFill>
-                          <a:srgbClr val="002060"/>
-                        </a:solidFill>
-                      </wps:spPr>
-                      <wps:style>
-                        <a:lnRef idx="2">
-                          <a:schemeClr val="accent1">
-                            <a:shade val="50000"/>
-                          </a:schemeClr>
-                        </a:lnRef>
-                        <a:fillRef idx="1">
-                          <a:schemeClr val="accent1"/>
-                        </a:fillRef>
-                        <a:effectRef idx="0">
-                          <a:schemeClr val="accent1"/>
-                        </a:effectRef>
-                        <a:fontRef idx="minor">
-                          <a:schemeClr val="lt1"/>
-                        </a:fontRef>
-                      </wps:style>
-                      <wps:txbx>
-                        <w:txbxContent>
-                          <w:p>
-                            <w:pPr>
-                              <w:jc w:val="center"/>
-                              <w:rPr>
-                                <w:color w:val="9CC2E5" w:themeColor="accent1" w:themeTint="99"/>
-                              </w:rPr>
-                            </w:pPr>
-                            <w:r>
-                              <w:rPr>
-                                <w:color w:val="9CC2E5" w:themeColor="accent1" w:themeTint="99"/>
-                              </w:rPr>
-                              <w:t>Docker</w:t>
-                            </w:r>
-                          </w:p>
-                        </w:txbxContent>
-                      </wps:txbx>
-                      <wps:bodyPr rot="0" spcFirstLastPara="0" vertOverflow="overflow" horzOverflow="overflow" vert="horz" wrap="square" lIns="91440" tIns="45720" rIns="91440" bIns="45720" numCol="1" spcCol="0" rtlCol="0" fromWordArt="0" anchor="ctr" anchorCtr="0" forceAA="0" compatLnSpc="1">
-                        <a:prstTxWarp prst="textNoShape">
-                          <a:avLst/>
-                        </a:prstTxWarp>
-                        <a:noAutofit/>
-                      </wps:bodyPr>
-                    </wps:wsp>
-                  </a:graphicData>
-                </a:graphic>
-              </wp:anchor>
-            </w:drawing>
-          </mc:Choice>
-          <mc:Fallback>
-            <w:pict>
-              <v:oval w14:anchorId="1737723B" id="Elipse 14" o:spid="_x0000_s1036" style="position:absolute;margin-left:179.85pt;margin-top:283.95pt;width:93.9pt;height:34pt;z-index:251673600;visibility:visible;mso-wrap-style:square;mso-wrap-distance-left:9pt;mso-wrap-distance-top:0;mso-wrap-distance-right:9pt;mso-wrap-distance-bottom:0;mso-position-horizontal:absolute;mso-position-horizontal-relative:text;mso-position-vertical:absolute;mso-position-vertical-relative:text;v-text-anchor:middle" o:gfxdata="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" fillcolor="#002060" strokecolor="#1f4d78 [1604]" strokeweight="1pt">
-                <v:stroke joinstyle="miter"/>
-                <v:textbox>
-                  <w:txbxContent>
-                    <w:p>
-                      <w:pPr>
-                        <w:jc w:val="center"/>
-                        <w:rPr>
-                          <w:color w:val="9CC2E5" w:themeColor="accent1" w:themeTint="99"/>
-                        </w:rPr>
-                      </w:pPr>
-                      <w:r>
-                        <w:rPr>
-                          <w:color w:val="9CC2E5" w:themeColor="accent1" w:themeTint="99"/>
-                        </w:rPr>
-                        <w:t>Docker</w:t>
-                      </w:r>
-                    </w:p>
-                  </w:txbxContent>
-                </v:textbox>
-              </v:oval>
-            </w:pict>
-          </mc:Fallback>
-        </mc:AlternateContent>
-      </w:r>
-      <w:r>
-        <w:rPr>
-          <w:noProof/>
-        </w:rPr>
-        <mc:AlternateContent>
-          <mc:Choice Requires="wps">
-            <w:drawing>
-              <wp:anchor distT="0" distB="0" distL="114300" distR="114300" simplePos="0" relativeHeight="251671552" behindDoc="0" locked="0" layoutInCell="1" allowOverlap="1" wp14:anchorId="4318ABC9" wp14:editId="7E0817EE">
+              <wp:anchor distT="0" distB="0" distL="114300" distR="114300" simplePos="0" relativeHeight="251671552" behindDoc="0" locked="0" layoutInCell="1" allowOverlap="1" wp14:anchorId="4318ABC9" wp14:editId="578DCFFF">
                 <wp:simplePos x="0" y="0"/>
                 <wp:positionH relativeFrom="column">
                   <wp:posOffset>1642643</wp:posOffset>
@@ -2861,7 +2490,7 @@
           </mc:Choice>
           <mc:Fallback>
             <w:pict>
-              <v:shapetype w14:anchorId="59BC54B0" id="_x0000_t34" coordsize="21600,21600" o:spt="34" o:oned="t" adj="10800" path="m,l@0,0@0,21600,21600,21600e" filled="f">
+              <v:shapetype w14:anchorId="7939DA35" id="_x0000_t34" coordsize="21600,21600" o:spt="34" o:oned="t" adj="10800" path="m,l@0,0@0,21600,21600,21600e" filled="f">
                 <v:stroke joinstyle="miter"/>
                 <v:formulas>
                   <v:f eqn="val #0"/>
@@ -2872,7 +2501,7 @@
                 </v:handles>
                 <o:lock v:ext="edit" shapetype="t"/>
               </v:shapetype>
-              <v:shape id="Conector: angular 12" o:spid="_x0000_s1026" type="#_x0000_t34" style="position:absolute;margin-left:129.35pt;margin-top:168.2pt;width:36.15pt;height:171.4pt;flip:x;z-index:251671552;visibility:visible;mso-wrap-style:square;mso-width-percent:0;mso-height-percent:0;mso-wrap-distance-left:9pt;mso-wrap-distance-top:0;mso-wrap-distance-right:9pt;mso-wrap-distance-bottom:0;mso-position-horizontal:absolute;mso-position-horizontal-relative:text;mso-position-vertical:absolute;mso-position-vertical-relative:text;mso-width-percent:0;mso-height-percent:0;mso-width-relative:margin;mso-height-relative:margin" o:gfxdata="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" adj="-36641" strokecolor="black [3213]" strokeweight=".5pt">
+              <v:shape id="Conector: angular 12" o:spid="_x0000_s1026" type="#_x0000_t34" style="position:absolute;margin-left:129.35pt;margin-top:168.2pt;width:36.15pt;height:171.4pt;flip:x;z-index:251671552;visibility:visible;mso-wrap-style:square;mso-width-percent:0;mso-height-percent:0;mso-wrap-distance-left:9pt;mso-wrap-distance-top:0;mso-wrap-distance-right:9pt;mso-wrap-distance-bottom:0;mso-position-horizontal:absolute;mso-position-horizontal-relative:text;mso-position-vertical:absolute;mso-position-vertical-relative:text;mso-width-percent:0;mso-height-percent:0;mso-width-relative:margin;mso-height-relative:margin" o:gfxdata="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" adj="-36641" strokecolor="black [3213]" strokeweight=".5pt">
                 <v:stroke endarrow="block"/>
               </v:shape>
             </w:pict>
@@ -3462,16 +3091,8 @@
                               <w:rPr>
                                 <w:color w:val="000000" w:themeColor="text1"/>
                               </w:rPr>
-                              <w:t xml:space="preserve"> </w:t>
-                            </w:r>
-                            <w:proofErr w:type="spellStart"/>
-                            <w:r>
-                              <w:rPr>
-                                <w:color w:val="000000" w:themeColor="text1"/>
-                              </w:rPr>
-                              <w:t>Layer</w:t>
-                            </w:r>
-                            <w:proofErr w:type="spellEnd"/>
+                              <w:t xml:space="preserve"> Layer</w:t>
+                            </w:r>
                           </w:p>
                         </w:txbxContent>
                       </wps:txbx>
@@ -3595,16 +3216,8 @@
                               <w:rPr>
                                 <w:color w:val="000000" w:themeColor="text1"/>
                               </w:rPr>
-                              <w:t xml:space="preserve"> </w:t>
-                            </w:r>
-                            <w:proofErr w:type="spellStart"/>
-                            <w:r>
-                              <w:rPr>
-                                <w:color w:val="000000" w:themeColor="text1"/>
-                              </w:rPr>
-                              <w:t>Layer</w:t>
-                            </w:r>
-                            <w:proofErr w:type="spellEnd"/>
+                              <w:t xml:space="preserve"> Layer</w:t>
+                            </w:r>
                           </w:p>
                         </w:txbxContent>
                       </wps:txbx>
@@ -3664,7 +3277,7 @@
 </file>
 
 <file path=word/styles.xml><?xml version="1.0" encoding="utf-8"?>
-<w:styles xmlns:mc="http://schemas.openxmlformats.org/markup-compatibility/2006" xmlns:r="http://schemas.openxmlformats.org/officeDocument/2006/relationships" xmlns:w="http://schemas.openxmlformats.org/wordprocessingml/2006/main" xmlns:w14="http://schemas.microsoft.com/office/word/2010/wordml" xmlns:w15="http://schemas.microsoft.com/office/word/2012/wordml" xmlns:w16cex="http://schemas.microsoft.com/office/word/2018/wordml/cex" xmlns:w16cid="http://schemas.microsoft.com/office/word/2016/wordml/cid" xmlns:w16="http://schemas.microsoft.com/office/word/2018/wordml" xmlns:w16sdtdh="http://schemas.microsoft.com/office/word/2020/wordml/sdtdatahash" xmlns:w16se="http://schemas.microsoft.com/office/word/2015/wordml/symex" mc:Ignorable="w14 w15 w16se w16cid w16 w16cex w16sdtdh">
+<w:styles xmlns:mc="http://schemas.openxmlformats.org/markup-compatibility/2006" xmlns:r="http://schemas.openxmlformats.org/officeDocument/2006/relationships" xmlns:w="http://schemas.openxmlformats.org/wordprocessingml/2006/main" xmlns:w14="http://schemas.microsoft.com/office/word/2010/wordml" xmlns:w15="http://schemas.microsoft.com/office/word/2012/wordml" xmlns:w16cex="http://schemas.microsoft.com/office/word/2018/wordml/cex" xmlns:w16cid="http://schemas.microsoft.com/office/word/2016/wordml/cid" xmlns:w16="http://schemas.microsoft.com/office/word/2018/wordml" xmlns:w16du="http://schemas.microsoft.com/office/word/2023/wordml/word16du" xmlns:w16sdtdh="http://schemas.microsoft.com/office/word/2020/wordml/sdtdatahash" xmlns:w16sdtfl="http://schemas.microsoft.com/office/word/2024/wordml/sdtformatlock" xmlns:w16se="http://schemas.microsoft.com/office/word/2015/wordml/symex" mc:Ignorable="w14 w15 w16se w16cid w16 w16cex w16sdtdh w16sdtfl w16du">
   <w:docDefaults>
     <w:rPrDefault>
       <w:rPr>
@@ -4069,7 +3682,6 @@
   <w:style w:type="character" w:default="1" w:styleId="Fuentedeprrafopredeter">
     <w:name w:val="Default Paragraph Font"/>
     <w:uiPriority w:val="1"/>
-    <w:semiHidden/>
     <w:unhideWhenUsed/>
   </w:style>
   <w:style w:type="table" w:default="1" w:styleId="Tablanormal">

</xml_diff>